<commit_message>
Add Wave 5: 5 Bryan Johnson newsjacking articles (respectful, LLA message in headers)
</commit_message>
<xml_diff>
--- a/eTeacher_LLA_Press_Releases.docx
+++ b/eTeacher_LLA_Press_Releases.docx
@@ -45,7 +45,7 @@
           <w:sz w:val="20"/>
           <w:szCs w:val="20"/>
         </w:rPr>
-        <w:t xml:space="preserve">17 articles across four waves · Every CEO quote written fresh, on-voice, and free of previously published lines.</w:t>
+        <w:t xml:space="preserve">22 articles across five waves · Every CEO quote written fresh, on-voice, and free of previously published lines.</w:t>
       </w:r>
     </w:p>
     <w:p>
@@ -4283,6 +4283,1172 @@
           <w:szCs w:val="16"/>
         </w:rPr>
         <w:t xml:space="preserve">NET-NEW CEO statement — flagged for Harel's approval. Fresh in his voice; does NOT reuse the published ‘cognitive atrophy’ line.</w:t>
+      </w:r>
+    </w:p>
+    <w:p>
+      <w:pPr>
+        <w:spacing w:after="40"/>
+      </w:pPr>
+      <w:r>
+        <w:rPr>
+          <w:rFonts w:ascii="Calibri" w:cs="Calibri" w:eastAsia="Calibri" w:hAnsi="Calibri"/>
+          <w:b/>
+          <w:bCs/>
+          <w:color w:val="5C6672"/>
+          <w:sz w:val="16"/>
+          <w:szCs w:val="16"/>
+        </w:rPr>
+        <w:t xml:space="preserve">Boilerplate: </w:t>
+      </w:r>
+      <w:r>
+        <w:rPr>
+          <w:rFonts w:ascii="Calibri" w:cs="Calibri" w:eastAsia="Calibri" w:hAnsi="Calibri"/>
+          <w:color w:val="5C6672"/>
+          <w:sz w:val="16"/>
+          <w:szCs w:val="16"/>
+        </w:rPr>
+        <w:t xml:space="preserve">About Longevity Life Academy / eTeacher Group: Longevity Life Academy is the fifth online school of eTeacher Group, an Israeli education company operating for 25 years that has delivered 400,000+ courses to students across nearly 200 countries. eTeacher pairs live, small-group instruction (classes of 8–15) with AI micro-learning, serves more than 10,000 learners a year with roughly 70% in the United States, and partners with institutions including the Hebrew University of Jerusalem.</w:t>
+      </w:r>
+    </w:p>
+    <w:p>
+      <w:pPr>
+        <w:pageBreakBefore/>
+        <w:spacing w:after="40" w:before="120"/>
+      </w:pPr>
+      <w:r>
+        <w:rPr>
+          <w:rFonts w:ascii="Calibri" w:cs="Calibri" w:eastAsia="Calibri" w:hAnsi="Calibri"/>
+          <w:b/>
+          <w:bCs/>
+          <w:color w:val="0C2A43"/>
+          <w:sz w:val="30"/>
+          <w:szCs w:val="30"/>
+        </w:rPr>
+        <w:t xml:space="preserve">Wave 5 — The Longevity Reset: Consistency Over Cost</w:t>
+      </w:r>
+    </w:p>
+    <w:p>
+      <w:pPr>
+        <w:pBdr>
+          <w:bottom w:val="single" w:color="9A6B12" w:sz="12" w:space="6"/>
+        </w:pBdr>
+        <w:spacing w:after="160"/>
+      </w:pPr>
+      <w:r>
+        <w:rPr>
+          <w:rFonts w:ascii="Calibri" w:cs="Calibri" w:eastAsia="Calibri" w:hAnsi="Calibri"/>
+          <w:i/>
+          <w:iCs/>
+          <w:color w:val="5C6672"/>
+          <w:sz w:val="20"/>
+          <w:szCs w:val="20"/>
+        </w:rPr>
+        <w:t xml:space="preserve">One message: You don't need $2 million a year to live longer — you need a live teacher, a small class, and habits that stick.</w:t>
+      </w:r>
+    </w:p>
+    <w:p>
+      <w:pPr>
+        <w:keepNext/>
+        <w:spacing w:after="20" w:before="220"/>
+      </w:pPr>
+      <w:r>
+        <w:rPr>
+          <w:rFonts w:ascii="Calibri" w:cs="Calibri" w:eastAsia="Calibri" w:hAnsi="Calibri"/>
+          <w:b/>
+          <w:bCs/>
+          <w:color w:val="9A6B12"/>
+          <w:sz w:val="18"/>
+          <w:szCs w:val="18"/>
+        </w:rPr>
+        <w:t xml:space="preserve">5.1  ·  Reactive news peg — the affordability contrast (respectful)</w:t>
+      </w:r>
+    </w:p>
+    <w:p>
+      <w:pPr>
+        <w:keepNext/>
+        <w:spacing w:after="20"/>
+      </w:pPr>
+      <w:r>
+        <w:rPr>
+          <w:rFonts w:ascii="Calibri" w:cs="Calibri" w:eastAsia="Calibri" w:hAnsi="Calibri"/>
+          <w:color w:val="5C6672"/>
+          <w:sz w:val="17"/>
+          <w:szCs w:val="17"/>
+        </w:rPr>
+        <w:t xml:space="preserve">Outlet target: Business Insider / Fortune Well / CNBC Make It</w:t>
+      </w:r>
+    </w:p>
+    <w:p>
+      <w:pPr>
+        <w:keepNext/>
+        <w:spacing w:after="40"/>
+      </w:pPr>
+      <w:r>
+        <w:rPr>
+          <w:rFonts w:ascii="Calibri" w:cs="Calibri" w:eastAsia="Calibri" w:hAnsi="Calibri"/>
+          <w:b/>
+          <w:bCs/>
+          <w:color w:val="0C2A43"/>
+          <w:sz w:val="26"/>
+          <w:szCs w:val="26"/>
+        </w:rPr>
+        <w:t xml:space="preserve">You Don't Need $2 Million a Year to Live Longer — Longevity Life Academy Teaches the Habits That Actually Stick, From $289 a Month</w:t>
+      </w:r>
+    </w:p>
+    <w:p>
+      <w:pPr>
+        <w:spacing w:after="120"/>
+      </w:pPr>
+      <w:r>
+        <w:rPr>
+          <w:rFonts w:ascii="Calibri" w:cs="Calibri" w:eastAsia="Calibri" w:hAnsi="Calibri"/>
+          <w:i/>
+          <w:iCs/>
+          <w:color w:val="1A1F26"/>
+          <w:sz w:val="21"/>
+          <w:szCs w:val="21"/>
+        </w:rPr>
+        <w:t xml:space="preserve">As the world's most-watched biohacker faces an incurable diagnosis, eTeacher's Longevity Life Academy makes its case: healthspan is built through consistent, learnable habits — taught live — not through spending most people could never match.</w:t>
+      </w:r>
+    </w:p>
+    <w:p>
+      <w:pPr>
+        <w:spacing w:after="100"/>
+        <w:jc w:val="left"/>
+      </w:pPr>
+      <w:r>
+        <w:rPr>
+          <w:rFonts w:ascii="Calibri" w:cs="Calibri" w:eastAsia="Calibri" w:hAnsi="Calibri"/>
+          <w:color w:val="1A1F26"/>
+          <w:sz w:val="20"/>
+          <w:szCs w:val="20"/>
+        </w:rPr>
+        <w:t xml:space="preserve">RAMAT GAN, Israel — This month, biohacker Bryan Johnson disclosed that he has been diagnosed with autoimmune gastritis, an incurable condition he says medicine can only manage. His candor deserves respect; illness spares no one, however carefully they live. But the moment also sharpens a question millions are now asking: if the most expensive longevity routine on earth can't guarantee an outcome, what should the rest of us actually do?</w:t>
+      </w:r>
+    </w:p>
+    <w:p>
+      <w:pPr>
+        <w:spacing w:after="100"/>
+        <w:jc w:val="left"/>
+      </w:pPr>
+      <w:r>
+        <w:rPr>
+          <w:rFonts w:ascii="Calibri" w:cs="Calibri" w:eastAsia="Calibri" w:hAnsi="Calibri"/>
+          <w:color w:val="1A1F26"/>
+          <w:sz w:val="20"/>
+          <w:szCs w:val="20"/>
+        </w:rPr>
+        <w:t xml:space="preserve">Longevity Life Academy, the fifth online school of 25-year education company eTeacher Group, was built for exactly that question. Its answer is not a bigger budget — it is a better teacher. The academy's 18-week live course turns healthy-aging science into one personalized protocol a student can keep for life, taught in small groups of 8–15 by named instructors, and grounded in each student's own body data.</w:t>
+      </w:r>
+    </w:p>
+    <w:p>
+      <w:pPr>
+        <w:spacing w:after="100"/>
+        <w:jc w:val="left"/>
+      </w:pPr>
+      <w:r>
+        <w:rPr>
+          <w:rFonts w:ascii="Calibri" w:cs="Calibri" w:eastAsia="Calibri" w:hAnsi="Calibri"/>
+          <w:color w:val="1A1F26"/>
+          <w:sz w:val="20"/>
+          <w:szCs w:val="20"/>
+        </w:rPr>
+        <w:t xml:space="preserve">The contrast the company points to is not a person — it is a philosophy. Johnson reportedly spends roughly $2 million a year. Longevity Life Academy starts at $289 a month and ships every US student an Abbott Lingo continuous glucose monitor before Lesson 5, so the science is personal from the start.</w:t>
+      </w:r>
+    </w:p>
+    <w:p>
+      <w:pPr>
+        <w:spacing w:after="100"/>
+        <w:jc w:val="left"/>
+      </w:pPr>
+      <w:r>
+        <w:rPr>
+          <w:rFonts w:ascii="Calibri" w:cs="Calibri" w:eastAsia="Calibri" w:hAnsi="Calibri"/>
+          <w:color w:val="1A1F26"/>
+          <w:sz w:val="20"/>
+          <w:szCs w:val="20"/>
+        </w:rPr>
+        <w:t xml:space="preserve">eTeacher argues the evidence for its approach is already public. Julie Gibson Clark, a 56-year-old single mother from Phoenix, held the number-two spot in the Rejuvenation Olympics for more than a year — ahead of Johnson — on a routine costing roughly $12 a day. Consistency, taught well, beat spending.</w:t>
+      </w:r>
+    </w:p>
+    <w:p>
+      <w:pPr>
+        <w:spacing w:after="100"/>
+        <w:jc w:val="left"/>
+      </w:pPr>
+      <w:r>
+        <w:rPr>
+          <w:rFonts w:ascii="Calibri" w:cs="Calibri" w:eastAsia="Calibri" w:hAnsi="Calibri"/>
+          <w:color w:val="1A1F26"/>
+          <w:sz w:val="20"/>
+          <w:szCs w:val="20"/>
+        </w:rPr>
+        <w:t xml:space="preserve">“We wish Bryan Johnson a full recovery, and we respect how openly he shares what he learns,” said Harel Tayeb, CEO of eTeacher Group. “But his news carries a lesson for everyone: a healthy life was never something you could buy in bulk. It is built one taught, repeated habit at a time — and that is something we can put within reach of an ordinary household.”</w:t>
+      </w:r>
+    </w:p>
+    <w:p>
+      <w:pPr>
+        <w:spacing w:after="100"/>
+        <w:jc w:val="left"/>
+      </w:pPr>
+      <w:r>
+        <w:rPr>
+          <w:rFonts w:ascii="Calibri" w:cs="Calibri" w:eastAsia="Calibri" w:hAnsi="Calibri"/>
+          <w:color w:val="1A1F26"/>
+          <w:sz w:val="20"/>
+          <w:szCs w:val="20"/>
+        </w:rPr>
+        <w:t xml:space="preserve">Longevity Life Academy is enrolling now from $289 per month, with additional courses planned for the year ahead.</w:t>
+      </w:r>
+    </w:p>
+    <w:p>
+      <w:pPr>
+        <w:pBdr>
+          <w:left w:val="single" w:color="0C2A43" w:sz="18" w:space="12"/>
+        </w:pBdr>
+        <w:spacing w:after="20" w:before="60"/>
+        <w:ind w:left="360"/>
+      </w:pPr>
+      <w:r>
+        <w:rPr>
+          <w:rFonts w:ascii="Calibri" w:cs="Calibri" w:eastAsia="Calibri" w:hAnsi="Calibri"/>
+          <w:b/>
+          <w:bCs/>
+          <w:color w:val="0C2A43"/>
+          <w:sz w:val="20"/>
+          <w:szCs w:val="20"/>
+        </w:rPr>
+        <w:t xml:space="preserve">CEO quote (Harel Tayeb): </w:t>
+      </w:r>
+      <w:r>
+        <w:rPr>
+          <w:rFonts w:ascii="Calibri" w:cs="Calibri" w:eastAsia="Calibri" w:hAnsi="Calibri"/>
+          <w:color w:val="1A1F26"/>
+          <w:sz w:val="20"/>
+          <w:szCs w:val="20"/>
+        </w:rPr>
+        <w:t xml:space="preserve">“We wish Bryan Johnson a full recovery, and we respect how openly he shares what he learns. But his news carries a lesson for everyone: a healthy life was never something you could buy in bulk. It is built one taught, repeated habit at a time — and that is something we can put within reach of an ordinary household.”</w:t>
+      </w:r>
+    </w:p>
+    <w:p>
+      <w:pPr>
+        <w:spacing w:after="100"/>
+        <w:ind w:left="360"/>
+      </w:pPr>
+      <w:r>
+        <w:rPr>
+          <w:rFonts w:ascii="Calibri" w:cs="Calibri" w:eastAsia="Calibri" w:hAnsi="Calibri"/>
+          <w:i/>
+          <w:iCs/>
+          <w:color w:val="5C6672"/>
+          <w:sz w:val="16"/>
+          <w:szCs w:val="16"/>
+        </w:rPr>
+        <w:t xml:space="preserve">NET-NEW CEO statement — flagged for Harel's approval. Leads with genuine respect/goodwill toward Johnson (no mockery), then pivots to LLA's affordability + consistency message. Verify comfort with naming him directly.</w:t>
+      </w:r>
+    </w:p>
+    <w:p>
+      <w:pPr>
+        <w:spacing w:after="40"/>
+      </w:pPr>
+      <w:r>
+        <w:rPr>
+          <w:rFonts w:ascii="Calibri" w:cs="Calibri" w:eastAsia="Calibri" w:hAnsi="Calibri"/>
+          <w:b/>
+          <w:bCs/>
+          <w:color w:val="5C6672"/>
+          <w:sz w:val="16"/>
+          <w:szCs w:val="16"/>
+        </w:rPr>
+        <w:t xml:space="preserve">Boilerplate: </w:t>
+      </w:r>
+      <w:r>
+        <w:rPr>
+          <w:rFonts w:ascii="Calibri" w:cs="Calibri" w:eastAsia="Calibri" w:hAnsi="Calibri"/>
+          <w:color w:val="5C6672"/>
+          <w:sz w:val="16"/>
+          <w:szCs w:val="16"/>
+        </w:rPr>
+        <w:t xml:space="preserve">About Longevity Life Academy / eTeacher Group: Longevity Life Academy is the fifth online school of eTeacher Group, an Israeli education company operating for 25 years that has delivered 400,000+ courses to students across nearly 200 countries. eTeacher pairs live, small-group instruction (classes of 8–15) with AI micro-learning, serves more than 10,000 learners a year with roughly 70% in the United States, and partners with institutions including the Hebrew University of Jerusalem.</w:t>
+      </w:r>
+    </w:p>
+    <w:p>
+      <w:pPr>
+        <w:keepNext/>
+        <w:spacing w:after="20" w:before="220"/>
+      </w:pPr>
+      <w:r>
+        <w:rPr>
+          <w:rFonts w:ascii="Calibri" w:cs="Calibri" w:eastAsia="Calibri" w:hAnsi="Calibri"/>
+          <w:b/>
+          <w:bCs/>
+          <w:color w:val="9A6B12"/>
+          <w:sz w:val="18"/>
+          <w:szCs w:val="18"/>
+        </w:rPr>
+        <w:t xml:space="preserve">5.2  ·  Early detection / know-your-own-data (health-desk, respectful)</w:t>
+      </w:r>
+    </w:p>
+    <w:p>
+      <w:pPr>
+        <w:keepNext/>
+        <w:spacing w:after="20"/>
+      </w:pPr>
+      <w:r>
+        <w:rPr>
+          <w:rFonts w:ascii="Calibri" w:cs="Calibri" w:eastAsia="Calibri" w:hAnsi="Calibri"/>
+          <w:color w:val="5C6672"/>
+          <w:sz w:val="17"/>
+          <w:szCs w:val="17"/>
+        </w:rPr>
+        <w:t xml:space="preserve">Outlet target: Fortune Well / Healthline / MedCity News</w:t>
+      </w:r>
+    </w:p>
+    <w:p>
+      <w:pPr>
+        <w:keepNext/>
+        <w:spacing w:after="40"/>
+      </w:pPr>
+      <w:r>
+        <w:rPr>
+          <w:rFonts w:ascii="Calibri" w:cs="Calibri" w:eastAsia="Calibri" w:hAnsi="Calibri"/>
+          <w:b/>
+          <w:bCs/>
+          <w:color w:val="0C2A43"/>
+          <w:sz w:val="26"/>
+          <w:szCs w:val="26"/>
+        </w:rPr>
+        <w:t xml:space="preserve">Longevity Life Academy Teaches Students to Read Their Own Biomarkers Early — So They Catch What Silent Conditions Hide</w:t>
+      </w:r>
+    </w:p>
+    <w:p>
+      <w:pPr>
+        <w:spacing w:after="120"/>
+      </w:pPr>
+      <w:r>
+        <w:rPr>
+          <w:rFonts w:ascii="Calibri" w:cs="Calibri" w:eastAsia="Calibri" w:hAnsi="Calibri"/>
+          <w:i/>
+          <w:iCs/>
+          <w:color w:val="1A1F26"/>
+          <w:sz w:val="21"/>
+          <w:szCs w:val="21"/>
+        </w:rPr>
+        <w:t xml:space="preserve">Bryan Johnson's autoimmune gastritis went undetected for years despite intensive monitoring. Longevity Life Academy is built on a simpler premise: teach ordinary people to read their own body data, consistently, before problems compound.</w:t>
+      </w:r>
+    </w:p>
+    <w:p>
+      <w:pPr>
+        <w:spacing w:after="100"/>
+        <w:jc w:val="left"/>
+      </w:pPr>
+      <w:r>
+        <w:rPr>
+          <w:rFonts w:ascii="Calibri" w:cs="Calibri" w:eastAsia="Calibri" w:hAnsi="Calibri"/>
+          <w:color w:val="1A1F26"/>
+          <w:sz w:val="20"/>
+          <w:szCs w:val="20"/>
+        </w:rPr>
+        <w:t xml:space="preserve">RAMAT GAN, Israel — One detail in Bryan Johnson's recent disclosure resonated with clinicians: even with elite monitoring, his autoimmune gastritis stayed hidden for years, surfacing only after persistent low iron was finally investigated. If a condition can hide from the world's most-tracked body, the case for teaching everyone to read their own data grows stronger, not weaker.</w:t>
+      </w:r>
+    </w:p>
+    <w:p>
+      <w:pPr>
+        <w:spacing w:after="100"/>
+        <w:jc w:val="left"/>
+      </w:pPr>
+      <w:r>
+        <w:rPr>
+          <w:rFonts w:ascii="Calibri" w:cs="Calibri" w:eastAsia="Calibri" w:hAnsi="Calibri"/>
+          <w:color w:val="1A1F26"/>
+          <w:sz w:val="20"/>
+          <w:szCs w:val="20"/>
+        </w:rPr>
+        <w:t xml:space="preserve">That is the founding premise of Longevity Life Academy, the fifth online school of 25-year education company eTeacher Group. The academy does not promise to out-spend disease. It teaches students to understand their own biomarkers — glucose, sleep, movement, and the numbers on their own lab reports — so they become active participants in their health rather than passive patients.</w:t>
+      </w:r>
+    </w:p>
+    <w:p>
+      <w:pPr>
+        <w:spacing w:after="100"/>
+        <w:jc w:val="left"/>
+      </w:pPr>
+      <w:r>
+        <w:rPr>
+          <w:rFonts w:ascii="Calibri" w:cs="Calibri" w:eastAsia="Calibri" w:hAnsi="Calibri"/>
+          <w:color w:val="1A1F26"/>
+          <w:sz w:val="20"/>
+          <w:szCs w:val="20"/>
+        </w:rPr>
+        <w:t xml:space="preserve">Every US student receives an Abbott Lingo continuous glucose monitor before Lesson 5, and the 18-week live curriculum builds the habit of asking what one's own body is signaling. Instruction happens in small groups of 8–15, led by named faculty, so questions get real answers in real time.</w:t>
+      </w:r>
+    </w:p>
+    <w:p>
+      <w:pPr>
+        <w:spacing w:after="100"/>
+        <w:jc w:val="left"/>
+      </w:pPr>
+      <w:r>
+        <w:rPr>
+          <w:rFonts w:ascii="Calibri" w:cs="Calibri" w:eastAsia="Calibri" w:hAnsi="Calibri"/>
+          <w:color w:val="1A1F26"/>
+          <w:sz w:val="20"/>
+          <w:szCs w:val="20"/>
+        </w:rPr>
+        <w:t xml:space="preserve">The academy is careful about its lane: it is education, not diagnosis, and it encourages students to work with their physicians. Its contribution is literacy — the daily, teachable skill of noticing change early, which even the most expensive protocols can't outsource.</w:t>
+      </w:r>
+    </w:p>
+    <w:p>
+      <w:pPr>
+        <w:spacing w:after="100"/>
+        <w:jc w:val="left"/>
+      </w:pPr>
+      <w:r>
+        <w:rPr>
+          <w:rFonts w:ascii="Calibri" w:cs="Calibri" w:eastAsia="Calibri" w:hAnsi="Calibri"/>
+          <w:color w:val="1A1F26"/>
+          <w:sz w:val="20"/>
+          <w:szCs w:val="20"/>
+        </w:rPr>
+        <w:t xml:space="preserve">“Bryan Johnson's experience is a reminder that no one is exempt, and that early awareness matters more than any single gadget,” said CEO Harel Tayeb. “We don't teach people to fear their bodies. We teach them to read them — calmly, consistently, and early enough to act.”</w:t>
+      </w:r>
+    </w:p>
+    <w:p>
+      <w:pPr>
+        <w:spacing w:after="100"/>
+        <w:jc w:val="left"/>
+      </w:pPr>
+      <w:r>
+        <w:rPr>
+          <w:rFonts w:ascii="Calibri" w:cs="Calibri" w:eastAsia="Calibri" w:hAnsi="Calibri"/>
+          <w:color w:val="1A1F26"/>
+          <w:sz w:val="20"/>
+          <w:szCs w:val="20"/>
+        </w:rPr>
+        <w:t xml:space="preserve">Longevity Life Academy is enrolling now from $289 per month.</w:t>
+      </w:r>
+    </w:p>
+    <w:p>
+      <w:pPr>
+        <w:pBdr>
+          <w:left w:val="single" w:color="0C2A43" w:sz="18" w:space="12"/>
+        </w:pBdr>
+        <w:spacing w:after="20" w:before="60"/>
+        <w:ind w:left="360"/>
+      </w:pPr>
+      <w:r>
+        <w:rPr>
+          <w:rFonts w:ascii="Calibri" w:cs="Calibri" w:eastAsia="Calibri" w:hAnsi="Calibri"/>
+          <w:b/>
+          <w:bCs/>
+          <w:color w:val="0C2A43"/>
+          <w:sz w:val="20"/>
+          <w:szCs w:val="20"/>
+        </w:rPr>
+        <w:t xml:space="preserve">CEO quote (Harel Tayeb): </w:t>
+      </w:r>
+      <w:r>
+        <w:rPr>
+          <w:rFonts w:ascii="Calibri" w:cs="Calibri" w:eastAsia="Calibri" w:hAnsi="Calibri"/>
+          <w:color w:val="1A1F26"/>
+          <w:sz w:val="20"/>
+          <w:szCs w:val="20"/>
+        </w:rPr>
+        <w:t xml:space="preserve">“Bryan Johnson's experience is a reminder that no one is exempt, and that early awareness matters more than any single gadget. We don't teach people to fear their bodies. We teach them to read them — calmly, consistently, and early enough to act.”</w:t>
+      </w:r>
+    </w:p>
+    <w:p>
+      <w:pPr>
+        <w:spacing w:after="100"/>
+        <w:ind w:left="360"/>
+      </w:pPr>
+      <w:r>
+        <w:rPr>
+          <w:rFonts w:ascii="Calibri" w:cs="Calibri" w:eastAsia="Calibri" w:hAnsi="Calibri"/>
+          <w:i/>
+          <w:iCs/>
+          <w:color w:val="5C6672"/>
+          <w:sz w:val="16"/>
+          <w:szCs w:val="16"/>
+        </w:rPr>
+        <w:t xml:space="preserve">NET-NEW CEO statement — flagged for Harel's approval. Respectful framing; positions LLA as education/literacy, not diagnosis (important liability guardrail).</w:t>
+      </w:r>
+    </w:p>
+    <w:p>
+      <w:pPr>
+        <w:spacing w:after="40"/>
+      </w:pPr>
+      <w:r>
+        <w:rPr>
+          <w:rFonts w:ascii="Calibri" w:cs="Calibri" w:eastAsia="Calibri" w:hAnsi="Calibri"/>
+          <w:b/>
+          <w:bCs/>
+          <w:color w:val="5C6672"/>
+          <w:sz w:val="16"/>
+          <w:szCs w:val="16"/>
+        </w:rPr>
+        <w:t xml:space="preserve">Boilerplate: </w:t>
+      </w:r>
+      <w:r>
+        <w:rPr>
+          <w:rFonts w:ascii="Calibri" w:cs="Calibri" w:eastAsia="Calibri" w:hAnsi="Calibri"/>
+          <w:color w:val="5C6672"/>
+          <w:sz w:val="16"/>
+          <w:szCs w:val="16"/>
+        </w:rPr>
+        <w:t xml:space="preserve">About Longevity Life Academy / eTeacher Group: Longevity Life Academy is the fifth online school of eTeacher Group, an Israeli education company operating for 25 years that has delivered 400,000+ courses to students across nearly 200 countries. eTeacher pairs live, small-group instruction (classes of 8–15) with AI micro-learning, serves more than 10,000 learners a year with roughly 70% in the United States, and partners with institutions including the Hebrew University of Jerusalem.</w:t>
+      </w:r>
+    </w:p>
+    <w:p>
+      <w:pPr>
+        <w:keepNext/>
+        <w:spacing w:after="20" w:before="220"/>
+      </w:pPr>
+      <w:r>
+        <w:rPr>
+          <w:rFonts w:ascii="Calibri" w:cs="Calibri" w:eastAsia="Calibri" w:hAnsi="Calibri"/>
+          <w:b/>
+          <w:bCs/>
+          <w:color w:val="9A6B12"/>
+          <w:sz w:val="18"/>
+          <w:szCs w:val="18"/>
+        </w:rPr>
+        <w:t xml:space="preserve">5.3  ·  The Julie contrast — $12 a day vs $2M a year (proof, respectful)</w:t>
+      </w:r>
+    </w:p>
+    <w:p>
+      <w:pPr>
+        <w:keepNext/>
+        <w:spacing w:after="20"/>
+      </w:pPr>
+      <w:r>
+        <w:rPr>
+          <w:rFonts w:ascii="Calibri" w:cs="Calibri" w:eastAsia="Calibri" w:hAnsi="Calibri"/>
+          <w:color w:val="5C6672"/>
+          <w:sz w:val="17"/>
+          <w:szCs w:val="17"/>
+        </w:rPr>
+        <w:t xml:space="preserve">Outlet target: People / Yahoo Life / Today</w:t>
+      </w:r>
+    </w:p>
+    <w:p>
+      <w:pPr>
+        <w:keepNext/>
+        <w:spacing w:after="40"/>
+      </w:pPr>
+      <w:r>
+        <w:rPr>
+          <w:rFonts w:ascii="Calibri" w:cs="Calibri" w:eastAsia="Calibri" w:hAnsi="Calibri"/>
+          <w:b/>
+          <w:bCs/>
+          <w:color w:val="0C2A43"/>
+          <w:sz w:val="26"/>
+          <w:szCs w:val="26"/>
+        </w:rPr>
+        <w:t xml:space="preserve">A $12-a-Day Routine Ranked Ahead of a $2-Million-a-Year One — Longevity Life Academy Teaches the Habits Behind It</w:t>
+      </w:r>
+    </w:p>
+    <w:p>
+      <w:pPr>
+        <w:spacing w:after="120"/>
+      </w:pPr>
+      <w:r>
+        <w:rPr>
+          <w:rFonts w:ascii="Calibri" w:cs="Calibri" w:eastAsia="Calibri" w:hAnsi="Calibri"/>
+          <w:i/>
+          <w:iCs/>
+          <w:color w:val="1A1F26"/>
+          <w:sz w:val="21"/>
+          <w:szCs w:val="21"/>
+        </w:rPr>
+        <w:t xml:space="preserve">Longevity Life Academy student-turned-instructor Julie Gibson Clark once ranked second in the Rejuvenation Olympics — ahead of Bryan Johnson — on a fraction of the budget. As Johnson faces a hard diagnosis, her story shows what consistency can do.</w:t>
+      </w:r>
+    </w:p>
+    <w:p>
+      <w:pPr>
+        <w:spacing w:after="100"/>
+        <w:jc w:val="left"/>
+      </w:pPr>
+      <w:r>
+        <w:rPr>
+          <w:rFonts w:ascii="Calibri" w:cs="Calibri" w:eastAsia="Calibri" w:hAnsi="Calibri"/>
+          <w:color w:val="1A1F26"/>
+          <w:sz w:val="20"/>
+          <w:szCs w:val="20"/>
+        </w:rPr>
+        <w:t xml:space="preserve">RAMAT GAN, Israel — The longevity conversation is at an inflection point. Bryan Johnson, its most famous figure, recently shared that he has an incurable autoimmune condition — a sobering reminder that spending is not the same as certainty. Longevity Life Academy, eTeacher Group's fifth online school, offers a quieter counter-story that predates the news.</w:t>
+      </w:r>
+    </w:p>
+    <w:p>
+      <w:pPr>
+        <w:spacing w:after="100"/>
+        <w:jc w:val="left"/>
+      </w:pPr>
+      <w:r>
+        <w:rPr>
+          <w:rFonts w:ascii="Calibri" w:cs="Calibri" w:eastAsia="Calibri" w:hAnsi="Calibri"/>
+          <w:color w:val="1A1F26"/>
+          <w:sz w:val="20"/>
+          <w:szCs w:val="20"/>
+        </w:rPr>
+        <w:t xml:space="preserve">Julie Gibson Clark, a 56-year-old single mother and former structural engineer from Phoenix, held the number-two position in the Rejuvenation Olympics for more than a year — ranking ahead of Johnson — while spending roughly $12 a day. Her DunedinPACE score of 0.665 indicated a pace of aging roughly a third slower than expected. She did it with sleep, nutrition, movement, and stress habits, kept consistently.</w:t>
+      </w:r>
+    </w:p>
+    <w:p>
+      <w:pPr>
+        <w:spacing w:after="100"/>
+        <w:jc w:val="left"/>
+      </w:pPr>
+      <w:r>
+        <w:rPr>
+          <w:rFonts w:ascii="Calibri" w:cs="Calibri" w:eastAsia="Calibri" w:hAnsi="Calibri"/>
+          <w:color w:val="1A1F26"/>
+          <w:sz w:val="20"/>
+          <w:szCs w:val="20"/>
+        </w:rPr>
+        <w:t xml:space="preserve">That is precisely what Longevity Life Academy teaches, and why the company brought Julie in as an instructor. The academy's 18-week live course, taught in groups of 8–15 with an Abbott Lingo glucose monitor shipped to every US student, turns the fundamentals she lives by into a protocol any motivated adult can learn and keep.</w:t>
+      </w:r>
+    </w:p>
+    <w:p>
+      <w:pPr>
+        <w:spacing w:after="100"/>
+        <w:jc w:val="left"/>
+      </w:pPr>
+      <w:r>
+        <w:rPr>
+          <w:rFonts w:ascii="Calibri" w:cs="Calibri" w:eastAsia="Calibri" w:hAnsi="Calibri"/>
+          <w:color w:val="1A1F26"/>
+          <w:sz w:val="20"/>
+          <w:szCs w:val="20"/>
+        </w:rPr>
+        <w:t xml:space="preserve">The point is not to diminish anyone's journey — Johnson's data-sharing has advanced the whole field. It is to show that the levers that matter most are affordable and learnable, and that a good teacher may matter more than a big budget.</w:t>
+      </w:r>
+    </w:p>
+    <w:p>
+      <w:pPr>
+        <w:spacing w:after="100"/>
+        <w:jc w:val="left"/>
+      </w:pPr>
+      <w:r>
+        <w:rPr>
+          <w:rFonts w:ascii="Calibri" w:cs="Calibri" w:eastAsia="Calibri" w:hAnsi="Calibri"/>
+          <w:color w:val="1A1F26"/>
+          <w:sz w:val="20"/>
+          <w:szCs w:val="20"/>
+        </w:rPr>
+        <w:t xml:space="preserve">“Julie proved something we build our whole school around: the fundamentals, done consistently, are extraordinarily powerful — and they don't require a fortune,” said CEO Harel Tayeb. “That is not a knock on anyone spending more. It is an invitation to everyone who assumed this was out of reach.”</w:t>
+      </w:r>
+    </w:p>
+    <w:p>
+      <w:pPr>
+        <w:spacing w:after="100"/>
+        <w:jc w:val="left"/>
+      </w:pPr>
+      <w:r>
+        <w:rPr>
+          <w:rFonts w:ascii="Calibri" w:cs="Calibri" w:eastAsia="Calibri" w:hAnsi="Calibri"/>
+          <w:color w:val="1A1F26"/>
+          <w:sz w:val="20"/>
+          <w:szCs w:val="20"/>
+        </w:rPr>
+        <w:t xml:space="preserve">Longevity Life Academy is enrolling now from $289 per month.</w:t>
+      </w:r>
+    </w:p>
+    <w:p>
+      <w:pPr>
+        <w:pBdr>
+          <w:left w:val="single" w:color="0C2A43" w:sz="18" w:space="12"/>
+        </w:pBdr>
+        <w:spacing w:after="20" w:before="60"/>
+        <w:ind w:left="360"/>
+      </w:pPr>
+      <w:r>
+        <w:rPr>
+          <w:rFonts w:ascii="Calibri" w:cs="Calibri" w:eastAsia="Calibri" w:hAnsi="Calibri"/>
+          <w:b/>
+          <w:bCs/>
+          <w:color w:val="0C2A43"/>
+          <w:sz w:val="20"/>
+          <w:szCs w:val="20"/>
+        </w:rPr>
+        <w:t xml:space="preserve">CEO quote (Harel Tayeb): </w:t>
+      </w:r>
+      <w:r>
+        <w:rPr>
+          <w:rFonts w:ascii="Calibri" w:cs="Calibri" w:eastAsia="Calibri" w:hAnsi="Calibri"/>
+          <w:color w:val="1A1F26"/>
+          <w:sz w:val="20"/>
+          <w:szCs w:val="20"/>
+        </w:rPr>
+        <w:t xml:space="preserve">“Julie proved something we build our whole school around: the fundamentals, done consistently, are extraordinarily powerful — and they don't require a fortune. That is not a knock on anyone spending more. It is an invitation to everyone who assumed this was out of reach.”</w:t>
+      </w:r>
+    </w:p>
+    <w:p>
+      <w:pPr>
+        <w:spacing w:after="100"/>
+        <w:ind w:left="360"/>
+      </w:pPr>
+      <w:r>
+        <w:rPr>
+          <w:rFonts w:ascii="Calibri" w:cs="Calibri" w:eastAsia="Calibri" w:hAnsi="Calibri"/>
+          <w:i/>
+          <w:iCs/>
+          <w:color w:val="5C6672"/>
+          <w:sz w:val="16"/>
+          <w:szCs w:val="16"/>
+        </w:rPr>
+        <w:t xml:space="preserve">NET-NEW CEO statement — flagged for Harel's approval. Julie's #2 ranking kept PAST-tense ('held'). Respectful toward Johnson.</w:t>
+      </w:r>
+    </w:p>
+    <w:p>
+      <w:pPr>
+        <w:spacing w:after="40"/>
+      </w:pPr>
+      <w:r>
+        <w:rPr>
+          <w:rFonts w:ascii="Calibri" w:cs="Calibri" w:eastAsia="Calibri" w:hAnsi="Calibri"/>
+          <w:b/>
+          <w:bCs/>
+          <w:color w:val="5C6672"/>
+          <w:sz w:val="16"/>
+          <w:szCs w:val="16"/>
+        </w:rPr>
+        <w:t xml:space="preserve">Boilerplate: </w:t>
+      </w:r>
+      <w:r>
+        <w:rPr>
+          <w:rFonts w:ascii="Calibri" w:cs="Calibri" w:eastAsia="Calibri" w:hAnsi="Calibri"/>
+          <w:color w:val="5C6672"/>
+          <w:sz w:val="16"/>
+          <w:szCs w:val="16"/>
+        </w:rPr>
+        <w:t xml:space="preserve">About Longevity Life Academy / eTeacher Group: Longevity Life Academy is the fifth online school of eTeacher Group, an Israeli education company operating for 25 years that has delivered 400,000+ courses to students across nearly 200 countries. eTeacher pairs live, small-group instruction (classes of 8–15) with AI micro-learning, serves more than 10,000 learners a year with roughly 70% in the United States, and partners with institutions including the Hebrew University of Jerusalem.</w:t>
+      </w:r>
+    </w:p>
+    <w:p>
+      <w:pPr>
+        <w:keepNext/>
+        <w:spacing w:after="20" w:before="220"/>
+      </w:pPr>
+      <w:r>
+        <w:rPr>
+          <w:rFonts w:ascii="Calibri" w:cs="Calibri" w:eastAsia="Calibri" w:hAnsi="Calibri"/>
+          <w:b/>
+          <w:bCs/>
+          <w:color w:val="9A6B12"/>
+          <w:sz w:val="18"/>
+          <w:szCs w:val="18"/>
+        </w:rPr>
+        <w:t xml:space="preserve">5.4  ·  Longevity for everyone / accessibility (op-ed style, respectful)</w:t>
+      </w:r>
+    </w:p>
+    <w:p>
+      <w:pPr>
+        <w:keepNext/>
+        <w:spacing w:after="20"/>
+      </w:pPr>
+      <w:r>
+        <w:rPr>
+          <w:rFonts w:ascii="Calibri" w:cs="Calibri" w:eastAsia="Calibri" w:hAnsi="Calibri"/>
+          <w:color w:val="5C6672"/>
+          <w:sz w:val="17"/>
+          <w:szCs w:val="17"/>
+        </w:rPr>
+        <w:t xml:space="preserve">Outlet target: Newsweek / USA Today opinion / Fast Company</w:t>
+      </w:r>
+    </w:p>
+    <w:p>
+      <w:pPr>
+        <w:keepNext/>
+        <w:spacing w:after="40"/>
+      </w:pPr>
+      <w:r>
+        <w:rPr>
+          <w:rFonts w:ascii="Calibri" w:cs="Calibri" w:eastAsia="Calibri" w:hAnsi="Calibri"/>
+          <w:b/>
+          <w:bCs/>
+          <w:color w:val="0C2A43"/>
+          <w:sz w:val="26"/>
+          <w:szCs w:val="26"/>
+        </w:rPr>
+        <w:t xml:space="preserve">Longevity Shouldn't Depend on Your Bank Balance — Longevity Life Academy Puts Science-Backed Healthy Aging Within Reach for $289 a Month</w:t>
+      </w:r>
+    </w:p>
+    <w:p>
+      <w:pPr>
+        <w:spacing w:after="120"/>
+      </w:pPr>
+      <w:r>
+        <w:rPr>
+          <w:rFonts w:ascii="Calibri" w:cs="Calibri" w:eastAsia="Calibri" w:hAnsi="Calibri"/>
+          <w:i/>
+          <w:iCs/>
+          <w:color w:val="1A1F26"/>
+          <w:sz w:val="21"/>
+          <w:szCs w:val="21"/>
+        </w:rPr>
+        <w:t xml:space="preserve">The biohacking headlines make longevity look like a billionaire's hobby. eTeacher's Longevity Life Academy exists to prove the opposite — that the science is teachable, and the habits are affordable.</w:t>
+      </w:r>
+    </w:p>
+    <w:p>
+      <w:pPr>
+        <w:spacing w:after="100"/>
+        <w:jc w:val="left"/>
+      </w:pPr>
+      <w:r>
+        <w:rPr>
+          <w:rFonts w:ascii="Calibri" w:cs="Calibri" w:eastAsia="Calibri" w:hAnsi="Calibri"/>
+          <w:color w:val="1A1F26"/>
+          <w:sz w:val="20"/>
+          <w:szCs w:val="20"/>
+        </w:rPr>
+        <w:t xml:space="preserve">RAMAT GAN, Israel — Every few months, longevity returns to the headlines through a single extraordinary figure and an extraordinary budget. The latest news — Bryan Johnson's disclosure of an incurable autoimmune condition — is a human moment first, and we wish him well. It is also a chance to correct a widespread misconception: that living longer is a game only the wealthy can play.</w:t>
+      </w:r>
+    </w:p>
+    <w:p>
+      <w:pPr>
+        <w:spacing w:after="100"/>
+        <w:jc w:val="left"/>
+      </w:pPr>
+      <w:r>
+        <w:rPr>
+          <w:rFonts w:ascii="Calibri" w:cs="Calibri" w:eastAsia="Calibri" w:hAnsi="Calibri"/>
+          <w:color w:val="1A1F26"/>
+          <w:sz w:val="20"/>
+          <w:szCs w:val="20"/>
+        </w:rPr>
+        <w:t xml:space="preserve">Longevity Life Academy, the fifth online school of 25-year education company eTeacher Group, is built on the opposite conviction. The science of healthy aging — sleep, nutrition, movement, stress, and personal biomarkers — is not proprietary to the rich. What most people lack is not money; it is a teacher, a structure, and the support to stay consistent.</w:t>
+      </w:r>
+    </w:p>
+    <w:p>
+      <w:pPr>
+        <w:spacing w:after="100"/>
+        <w:jc w:val="left"/>
+      </w:pPr>
+      <w:r>
+        <w:rPr>
+          <w:rFonts w:ascii="Calibri" w:cs="Calibri" w:eastAsia="Calibri" w:hAnsi="Calibri"/>
+          <w:color w:val="1A1F26"/>
+          <w:sz w:val="20"/>
+          <w:szCs w:val="20"/>
+        </w:rPr>
+        <w:t xml:space="preserve">The academy's flagship 18-week course delivers all three: live sessions with named instructors, small cohorts of 8–15, and an Abbott Lingo continuous glucose monitor shipped to every US student before Lesson 5 — all starting at $289 a month. It is the same live-teaching method eTeacher has used to deliver 400,000+ courses across nearly 200 countries, now aimed at healthspan.</w:t>
+      </w:r>
+    </w:p>
+    <w:p>
+      <w:pPr>
+        <w:spacing w:after="100"/>
+        <w:jc w:val="left"/>
+      </w:pPr>
+      <w:r>
+        <w:rPr>
+          <w:rFonts w:ascii="Calibri" w:cs="Calibri" w:eastAsia="Calibri" w:hAnsi="Calibri"/>
+          <w:color w:val="1A1F26"/>
+          <w:sz w:val="20"/>
+          <w:szCs w:val="20"/>
+        </w:rPr>
+        <w:t xml:space="preserve">This is not about competing with anyone's regimen. It is about widening the door — taking the parts of longevity science that genuinely work for ordinary people and teaching them in a way that sticks.</w:t>
+      </w:r>
+    </w:p>
+    <w:p>
+      <w:pPr>
+        <w:spacing w:after="100"/>
+        <w:jc w:val="left"/>
+      </w:pPr>
+      <w:r>
+        <w:rPr>
+          <w:rFonts w:ascii="Calibri" w:cs="Calibri" w:eastAsia="Calibri" w:hAnsi="Calibri"/>
+          <w:color w:val="1A1F26"/>
+          <w:sz w:val="20"/>
+          <w:szCs w:val="20"/>
+        </w:rPr>
+        <w:t xml:space="preserve">“A longer, stronger life should not depend on your bank balance,” said CEO Harel Tayeb. “The billionaires can afford to experiment. Our job is to take what is proven, teach it live, and make it something a working family can actually follow.”</w:t>
+      </w:r>
+    </w:p>
+    <w:p>
+      <w:pPr>
+        <w:spacing w:after="100"/>
+        <w:jc w:val="left"/>
+      </w:pPr>
+      <w:r>
+        <w:rPr>
+          <w:rFonts w:ascii="Calibri" w:cs="Calibri" w:eastAsia="Calibri" w:hAnsi="Calibri"/>
+          <w:color w:val="1A1F26"/>
+          <w:sz w:val="20"/>
+          <w:szCs w:val="20"/>
+        </w:rPr>
+        <w:t xml:space="preserve">Longevity Life Academy is enrolling now from $289 per month.</w:t>
+      </w:r>
+    </w:p>
+    <w:p>
+      <w:pPr>
+        <w:pBdr>
+          <w:left w:val="single" w:color="0C2A43" w:sz="18" w:space="12"/>
+        </w:pBdr>
+        <w:spacing w:after="20" w:before="60"/>
+        <w:ind w:left="360"/>
+      </w:pPr>
+      <w:r>
+        <w:rPr>
+          <w:rFonts w:ascii="Calibri" w:cs="Calibri" w:eastAsia="Calibri" w:hAnsi="Calibri"/>
+          <w:b/>
+          <w:bCs/>
+          <w:color w:val="0C2A43"/>
+          <w:sz w:val="20"/>
+          <w:szCs w:val="20"/>
+        </w:rPr>
+        <w:t xml:space="preserve">CEO quote (Harel Tayeb): </w:t>
+      </w:r>
+      <w:r>
+        <w:rPr>
+          <w:rFonts w:ascii="Calibri" w:cs="Calibri" w:eastAsia="Calibri" w:hAnsi="Calibri"/>
+          <w:color w:val="1A1F26"/>
+          <w:sz w:val="20"/>
+          <w:szCs w:val="20"/>
+        </w:rPr>
+        <w:t xml:space="preserve">“A longer, stronger life should not depend on your bank balance. The billionaires can afford to experiment. Our job is to take what is proven, teach it live, and make it something a working family can actually follow.”</w:t>
+      </w:r>
+    </w:p>
+    <w:p>
+      <w:pPr>
+        <w:spacing w:after="100"/>
+        <w:ind w:left="360"/>
+      </w:pPr>
+      <w:r>
+        <w:rPr>
+          <w:rFonts w:ascii="Calibri" w:cs="Calibri" w:eastAsia="Calibri" w:hAnsi="Calibri"/>
+          <w:i/>
+          <w:iCs/>
+          <w:color w:val="5C6672"/>
+          <w:sz w:val="16"/>
+          <w:szCs w:val="16"/>
+        </w:rPr>
+        <w:t xml:space="preserve">NET-NEW CEO statement — flagged for Harel's approval. 'Billionaires can afford to experiment' is pointed but not disrespectful to Johnson personally — confirm tone comfort.</w:t>
+      </w:r>
+    </w:p>
+    <w:p>
+      <w:pPr>
+        <w:spacing w:after="40"/>
+      </w:pPr>
+      <w:r>
+        <w:rPr>
+          <w:rFonts w:ascii="Calibri" w:cs="Calibri" w:eastAsia="Calibri" w:hAnsi="Calibri"/>
+          <w:b/>
+          <w:bCs/>
+          <w:color w:val="5C6672"/>
+          <w:sz w:val="16"/>
+          <w:szCs w:val="16"/>
+        </w:rPr>
+        <w:t xml:space="preserve">Boilerplate: </w:t>
+      </w:r>
+      <w:r>
+        <w:rPr>
+          <w:rFonts w:ascii="Calibri" w:cs="Calibri" w:eastAsia="Calibri" w:hAnsi="Calibri"/>
+          <w:color w:val="5C6672"/>
+          <w:sz w:val="16"/>
+          <w:szCs w:val="16"/>
+        </w:rPr>
+        <w:t xml:space="preserve">About Longevity Life Academy / eTeacher Group: Longevity Life Academy is the fifth online school of eTeacher Group, an Israeli education company operating for 25 years that has delivered 400,000+ courses to students across nearly 200 countries. eTeacher pairs live, small-group instruction (classes of 8–15) with AI micro-learning, serves more than 10,000 learners a year with roughly 70% in the United States, and partners with institutions including the Hebrew University of Jerusalem.</w:t>
+      </w:r>
+    </w:p>
+    <w:p>
+      <w:pPr>
+        <w:keepNext/>
+        <w:spacing w:after="20" w:before="220"/>
+      </w:pPr>
+      <w:r>
+        <w:rPr>
+          <w:rFonts w:ascii="Calibri" w:cs="Calibri" w:eastAsia="Calibri" w:hAnsi="Calibri"/>
+          <w:b/>
+          <w:bCs/>
+          <w:color w:val="9A6B12"/>
+          <w:sz w:val="18"/>
+          <w:szCs w:val="18"/>
+        </w:rPr>
+        <w:t xml:space="preserve">5.5  ·  Live teaching vs solo biohacking (method story, respectful)</w:t>
+      </w:r>
+    </w:p>
+    <w:p>
+      <w:pPr>
+        <w:keepNext/>
+        <w:spacing w:after="20"/>
+      </w:pPr>
+      <w:r>
+        <w:rPr>
+          <w:rFonts w:ascii="Calibri" w:cs="Calibri" w:eastAsia="Calibri" w:hAnsi="Calibri"/>
+          <w:color w:val="5C6672"/>
+          <w:sz w:val="17"/>
+          <w:szCs w:val="17"/>
+        </w:rPr>
+        <w:t xml:space="preserve">Outlet target: EdSurge / Fast Company / Longevity.Technology</w:t>
+      </w:r>
+    </w:p>
+    <w:p>
+      <w:pPr>
+        <w:keepNext/>
+        <w:spacing w:after="40"/>
+      </w:pPr>
+      <w:r>
+        <w:rPr>
+          <w:rFonts w:ascii="Calibri" w:cs="Calibri" w:eastAsia="Calibri" w:hAnsi="Calibri"/>
+          <w:b/>
+          <w:bCs/>
+          <w:color w:val="0C2A43"/>
+          <w:sz w:val="26"/>
+          <w:szCs w:val="26"/>
+        </w:rPr>
+        <w:t xml:space="preserve">Longevity Life Academy Bets on Live Teachers, Not Solo Experiments — Because Habits Stick When Someone Teaches You</w:t>
+      </w:r>
+    </w:p>
+    <w:p>
+      <w:pPr>
+        <w:spacing w:after="120"/>
+      </w:pPr>
+      <w:r>
+        <w:rPr>
+          <w:rFonts w:ascii="Calibri" w:cs="Calibri" w:eastAsia="Calibri" w:hAnsi="Calibri"/>
+          <w:i/>
+          <w:iCs/>
+          <w:color w:val="1A1F26"/>
+          <w:sz w:val="21"/>
+          <w:szCs w:val="21"/>
+        </w:rPr>
+        <w:t xml:space="preserve">The most famous longevity story is a solo experiment run at enormous cost. eTeacher's Longevity Life Academy is the opposite model: live teachers, small classes, and a structure built so ordinary people actually stay the course.</w:t>
+      </w:r>
+    </w:p>
+    <w:p>
+      <w:pPr>
+        <w:spacing w:after="100"/>
+        <w:jc w:val="left"/>
+      </w:pPr>
+      <w:r>
+        <w:rPr>
+          <w:rFonts w:ascii="Calibri" w:cs="Calibri" w:eastAsia="Calibri" w:hAnsi="Calibri"/>
+          <w:color w:val="1A1F26"/>
+          <w:sz w:val="20"/>
+          <w:szCs w:val="20"/>
+        </w:rPr>
+        <w:t xml:space="preserve">RAMAT GAN, Israel — Bryan Johnson's Blueprint is the defining image of modern longevity: one person, a large team, and a vast budget, self-experimenting in public. His openness has taught the field a great deal, and his recent autoimmune-gastritis diagnosis is a reminder of how hard the work is even at that scale. But it also raises a practical question for everyone else: what model works when you don't have a lab and millions to spend?</w:t>
+      </w:r>
+    </w:p>
+    <w:p>
+      <w:pPr>
+        <w:spacing w:after="100"/>
+        <w:jc w:val="left"/>
+      </w:pPr>
+      <w:r>
+        <w:rPr>
+          <w:rFonts w:ascii="Calibri" w:cs="Calibri" w:eastAsia="Calibri" w:hAnsi="Calibri"/>
+          <w:color w:val="1A1F26"/>
+          <w:sz w:val="20"/>
+          <w:szCs w:val="20"/>
+        </w:rPr>
+        <w:t xml:space="preserve">eTeacher Group's answer, delivered through its fifth online school, Longevity Life Academy, is decades old and deceptively simple: people learn best from teachers, live, in small groups. Where solo biohacking asks individuals to self-direct, LLA provides a weekly live anchor session, an expert instructor, a cohort of 8–15 peers, and short daily practice — the structure that turns intentions into habits.</w:t>
+      </w:r>
+    </w:p>
+    <w:p>
+      <w:pPr>
+        <w:spacing w:after="100"/>
+        <w:jc w:val="left"/>
+      </w:pPr>
+      <w:r>
+        <w:rPr>
+          <w:rFonts w:ascii="Calibri" w:cs="Calibri" w:eastAsia="Calibri" w:hAnsi="Calibri"/>
+          <w:color w:val="1A1F26"/>
+          <w:sz w:val="20"/>
+          <w:szCs w:val="20"/>
+        </w:rPr>
+        <w:t xml:space="preserve">The academy applies the same method behind eTeacher's 400,000+ courses to healthspan. Each 18-week program pairs live instruction with personal data — an Abbott Lingo continuous glucose monitor ships to every US student before Lesson 5 — so lessons are grounded in the student's own body, guided by a real teacher rather than a lonely feed of tips.</w:t>
+      </w:r>
+    </w:p>
+    <w:p>
+      <w:pPr>
+        <w:spacing w:after="100"/>
+        <w:jc w:val="left"/>
+      </w:pPr>
+      <w:r>
+        <w:rPr>
+          <w:rFonts w:ascii="Calibri" w:cs="Calibri" w:eastAsia="Calibri" w:hAnsi="Calibri"/>
+          <w:color w:val="1A1F26"/>
+          <w:sz w:val="20"/>
+          <w:szCs w:val="20"/>
+        </w:rPr>
+        <w:t xml:space="preserve">The company's thesis is that persistence, not information, is the scarce resource in wellness — and that persistence is a social act. A teacher who knows your name and a small class that expects you back do what a dashboard alone cannot.</w:t>
+      </w:r>
+    </w:p>
+    <w:p>
+      <w:pPr>
+        <w:spacing w:after="100"/>
+        <w:jc w:val="left"/>
+      </w:pPr>
+      <w:r>
+        <w:rPr>
+          <w:rFonts w:ascii="Calibri" w:cs="Calibri" w:eastAsia="Calibri" w:hAnsi="Calibri"/>
+          <w:color w:val="1A1F26"/>
+          <w:sz w:val="20"/>
+          <w:szCs w:val="20"/>
+        </w:rPr>
+        <w:t xml:space="preserve">“The hardest part of living longer isn't knowing what to do — it's doing it next week, and the week after,” said CEO Harel Tayeb. “That is why we put a real teacher in the room. You can experiment alone, or you can be taught, supported, and expected back. We built our whole school on the second one.”</w:t>
+      </w:r>
+    </w:p>
+    <w:p>
+      <w:pPr>
+        <w:spacing w:after="100"/>
+        <w:jc w:val="left"/>
+      </w:pPr>
+      <w:r>
+        <w:rPr>
+          <w:rFonts w:ascii="Calibri" w:cs="Calibri" w:eastAsia="Calibri" w:hAnsi="Calibri"/>
+          <w:color w:val="1A1F26"/>
+          <w:sz w:val="20"/>
+          <w:szCs w:val="20"/>
+        </w:rPr>
+        <w:t xml:space="preserve">Longevity Life Academy is enrolling now from $289 per month.</w:t>
+      </w:r>
+    </w:p>
+    <w:p>
+      <w:pPr>
+        <w:pBdr>
+          <w:left w:val="single" w:color="0C2A43" w:sz="18" w:space="12"/>
+        </w:pBdr>
+        <w:spacing w:after="20" w:before="60"/>
+        <w:ind w:left="360"/>
+      </w:pPr>
+      <w:r>
+        <w:rPr>
+          <w:rFonts w:ascii="Calibri" w:cs="Calibri" w:eastAsia="Calibri" w:hAnsi="Calibri"/>
+          <w:b/>
+          <w:bCs/>
+          <w:color w:val="0C2A43"/>
+          <w:sz w:val="20"/>
+          <w:szCs w:val="20"/>
+        </w:rPr>
+        <w:t xml:space="preserve">CEO quote (Harel Tayeb): </w:t>
+      </w:r>
+      <w:r>
+        <w:rPr>
+          <w:rFonts w:ascii="Calibri" w:cs="Calibri" w:eastAsia="Calibri" w:hAnsi="Calibri"/>
+          <w:color w:val="1A1F26"/>
+          <w:sz w:val="20"/>
+          <w:szCs w:val="20"/>
+        </w:rPr>
+        <w:t xml:space="preserve">“The hardest part of living longer isn't knowing what to do — it's doing it next week, and the week after. That is why we put a real teacher in the room. You can experiment alone, or you can be taught, supported, and expected back. We built our whole school on the second one.”</w:t>
+      </w:r>
+    </w:p>
+    <w:p>
+      <w:pPr>
+        <w:spacing w:after="100"/>
+        <w:ind w:left="360"/>
+      </w:pPr>
+      <w:r>
+        <w:rPr>
+          <w:rFonts w:ascii="Calibri" w:cs="Calibri" w:eastAsia="Calibri" w:hAnsi="Calibri"/>
+          <w:i/>
+          <w:iCs/>
+          <w:color w:val="5C6672"/>
+          <w:sz w:val="16"/>
+          <w:szCs w:val="16"/>
+        </w:rPr>
+        <w:t xml:space="preserve">NET-NEW CEO statement — flagged for Harel's approval. Contrasts LLA's live-teaching method with solo biohacking without disparaging Johnson personally.</w:t>
       </w:r>
     </w:p>
     <w:p>

</xml_diff>

<commit_message>
Wave 5: Bryan Johnson in every headline; fix body/quote overflow on 5.1 & 5.5
</commit_message>
<xml_diff>
--- a/eTeacher_LLA_Press_Releases.docx
+++ b/eTeacher_LLA_Press_Releases.docx
@@ -4392,7 +4392,7 @@
           <w:sz w:val="26"/>
           <w:szCs w:val="26"/>
         </w:rPr>
-        <w:t xml:space="preserve">You Don't Need $2 Million a Year to Live Longer — Longevity Life Academy Teaches the Habits That Actually Stick, From $289 a Month</w:t>
+        <w:t xml:space="preserve">Bryan Johnson Spends $2 Million a Year — Longevity Life Academy Teaches the Same Healthy-Aging Habits, Live, From $289 a Month</w:t>
       </w:r>
     </w:p>
     <w:p>
@@ -4423,22 +4423,22 @@
           <w:sz w:val="20"/>
           <w:szCs w:val="20"/>
         </w:rPr>
-        <w:t xml:space="preserve">RAMAT GAN, Israel — This month, biohacker Bryan Johnson disclosed that he has been diagnosed with autoimmune gastritis, an incurable condition he says medicine can only manage. His candor deserves respect; illness spares no one, however carefully they live. But the moment also sharpens a question millions are now asking: if the most expensive longevity routine on earth can't guarantee an outcome, what should the rest of us actually do?</w:t>
-      </w:r>
-    </w:p>
-    <w:p>
-      <w:pPr>
-        <w:spacing w:after="100"/>
-        <w:jc w:val="left"/>
-      </w:pPr>
-      <w:r>
-        <w:rPr>
-          <w:rFonts w:ascii="Calibri" w:cs="Calibri" w:eastAsia="Calibri" w:hAnsi="Calibri"/>
-          <w:color w:val="1A1F26"/>
-          <w:sz w:val="20"/>
-          <w:szCs w:val="20"/>
-        </w:rPr>
-        <w:t xml:space="preserve">Longevity Life Academy, the fifth online school of 25-year education company eTeacher Group, was built for exactly that question. Its answer is not a bigger budget — it is a better teacher. The academy's 18-week live course turns healthy-aging science into one personalized protocol a student can keep for life, taught in small groups of 8–15 by named instructors, and grounded in each student's own body data.</w:t>
+        <w:t xml:space="preserve">RAMAT GAN, Israel — This month, biohacker Bryan Johnson disclosed that he has been diagnosed with autoimmune gastritis, an incurable condition he says medicine can only manage. His candor deserves respect; illness spares no one. But it sharpens a question millions are now asking: if the most expensive longevity routine on earth can't guarantee an outcome, what should the rest of us actually do?</w:t>
+      </w:r>
+    </w:p>
+    <w:p>
+      <w:pPr>
+        <w:spacing w:after="100"/>
+        <w:jc w:val="left"/>
+      </w:pPr>
+      <w:r>
+        <w:rPr>
+          <w:rFonts w:ascii="Calibri" w:cs="Calibri" w:eastAsia="Calibri" w:hAnsi="Calibri"/>
+          <w:color w:val="1A1F26"/>
+          <w:sz w:val="20"/>
+          <w:szCs w:val="20"/>
+        </w:rPr>
+        <w:t xml:space="preserve">Longevity Life Academy, the fifth online school of 25-year education company eTeacher Group, was built for exactly that question. Its answer is not a bigger budget — it is a better teacher. The academy's 18-week live course turns healthy-aging science into one personalized protocol a student keeps for life, taught in small groups of 8–15 by named instructors and grounded in each student's own body data.</w:t>
       </w:r>
     </w:p>
     <w:p>
@@ -4468,7 +4468,7 @@
           <w:sz w:val="20"/>
           <w:szCs w:val="20"/>
         </w:rPr>
-        <w:t xml:space="preserve">eTeacher argues the evidence for its approach is already public. Julie Gibson Clark, a 56-year-old single mother from Phoenix, held the number-two spot in the Rejuvenation Olympics for more than a year — ahead of Johnson — on a routine costing roughly $12 a day. Consistency, taught well, beat spending.</w:t>
+        <w:t xml:space="preserve">eTeacher argues the evidence is already public. Julie Gibson Clark, a 56-year-old single mother from Phoenix, held the number-two spot in the Rejuvenation Olympics for more than a year — ahead of Johnson — on a routine costing roughly $12 a day. Consistency, taught well, beat spending.</w:t>
       </w:r>
     </w:p>
     <w:p>
@@ -4618,7 +4618,7 @@
           <w:sz w:val="26"/>
           <w:szCs w:val="26"/>
         </w:rPr>
-        <w:t xml:space="preserve">Longevity Life Academy Teaches Students to Read Their Own Biomarkers Early — So They Catch What Silent Conditions Hide</w:t>
+        <w:t xml:space="preserve">Bryan Johnson's Diagnosis Hid for Years — Longevity Life Academy Teaches Students to Read Their Own Biomarkers Early</w:t>
       </w:r>
     </w:p>
     <w:p>
@@ -4844,7 +4844,7 @@
           <w:sz w:val="26"/>
           <w:szCs w:val="26"/>
         </w:rPr>
-        <w:t xml:space="preserve">A $12-a-Day Routine Ranked Ahead of a $2-Million-a-Year One — Longevity Life Academy Teaches the Habits Behind It</w:t>
+        <w:t xml:space="preserve">Her $12-a-Day Routine Ranked Ahead of Bryan Johnson — Longevity Life Academy Teaches the Habits Behind It, From $289 a Month</w:t>
       </w:r>
     </w:p>
     <w:p>
@@ -5070,7 +5070,7 @@
           <w:sz w:val="26"/>
           <w:szCs w:val="26"/>
         </w:rPr>
-        <w:t xml:space="preserve">Longevity Shouldn't Depend on Your Bank Balance — Longevity Life Academy Puts Science-Backed Healthy Aging Within Reach for $289 a Month</w:t>
+        <w:t xml:space="preserve">You Don't Need Bryan Johnson's Budget to Live Longer — Longevity Life Academy Puts Science-Backed Healthy Aging Within Reach for $289 a Month</w:t>
       </w:r>
     </w:p>
     <w:p>
@@ -5296,7 +5296,7 @@
           <w:sz w:val="26"/>
           <w:szCs w:val="26"/>
         </w:rPr>
-        <w:t xml:space="preserve">Longevity Life Academy Bets on Live Teachers, Not Solo Experiments — Because Habits Stick When Someone Teaches You</w:t>
+        <w:t xml:space="preserve">Where Bryan Johnson Experiments Alone, Longevity Life Academy Bets on Live Teachers — Because Habits Stick When Someone Teaches You</w:t>
       </w:r>
     </w:p>
     <w:p>
@@ -5327,22 +5327,22 @@
           <w:sz w:val="20"/>
           <w:szCs w:val="20"/>
         </w:rPr>
-        <w:t xml:space="preserve">RAMAT GAN, Israel — Bryan Johnson's Blueprint is the defining image of modern longevity: one person, a large team, and a vast budget, self-experimenting in public. His openness has taught the field a great deal, and his recent autoimmune-gastritis diagnosis is a reminder of how hard the work is even at that scale. But it also raises a practical question for everyone else: what model works when you don't have a lab and millions to spend?</w:t>
-      </w:r>
-    </w:p>
-    <w:p>
-      <w:pPr>
-        <w:spacing w:after="100"/>
-        <w:jc w:val="left"/>
-      </w:pPr>
-      <w:r>
-        <w:rPr>
-          <w:rFonts w:ascii="Calibri" w:cs="Calibri" w:eastAsia="Calibri" w:hAnsi="Calibri"/>
-          <w:color w:val="1A1F26"/>
-          <w:sz w:val="20"/>
-          <w:szCs w:val="20"/>
-        </w:rPr>
-        <w:t xml:space="preserve">eTeacher Group's answer, delivered through its fifth online school, Longevity Life Academy, is decades old and deceptively simple: people learn best from teachers, live, in small groups. Where solo biohacking asks individuals to self-direct, LLA provides a weekly live anchor session, an expert instructor, a cohort of 8–15 peers, and short daily practice — the structure that turns intentions into habits.</w:t>
+        <w:t xml:space="preserve">RAMAT GAN, Israel — Bryan Johnson's Blueprint is the defining image of modern longevity: one person, a large team, and a vast budget, self-experimenting in public. His openness has taught the field a great deal, and his recent autoimmune-gastritis diagnosis is a reminder of how hard the work is even at that scale. But it raises a practical question for everyone else: what works when you don't have a lab and millions to spend?</w:t>
+      </w:r>
+    </w:p>
+    <w:p>
+      <w:pPr>
+        <w:spacing w:after="100"/>
+        <w:jc w:val="left"/>
+      </w:pPr>
+      <w:r>
+        <w:rPr>
+          <w:rFonts w:ascii="Calibri" w:cs="Calibri" w:eastAsia="Calibri" w:hAnsi="Calibri"/>
+          <w:color w:val="1A1F26"/>
+          <w:sz w:val="20"/>
+          <w:szCs w:val="20"/>
+        </w:rPr>
+        <w:t xml:space="preserve">eTeacher Group's answer, delivered through its fifth online school, Longevity Life Academy, is decades old and simple: people learn best from teachers, live, in small groups. Where solo biohacking asks individuals to self-direct, LLA provides a weekly live anchor session, an expert instructor, a cohort of 8–15 peers, and short daily practice — the structure that turns intentions into habits.</w:t>
       </w:r>
     </w:p>
     <w:p>

</xml_diff>

<commit_message>
Remove price from all headlines
</commit_message>
<xml_diff>
--- a/eTeacher_LLA_Press_Releases.docx
+++ b/eTeacher_LLA_Press_Releases.docx
@@ -674,7 +674,7 @@
           <w:sz w:val="26"/>
           <w:szCs w:val="26"/>
         </w:rPr>
-        <w:t xml:space="preserve">Longevity Life Academy Targets the Middle of the $8 Trillion Longevity Market — From $289 a Month</w:t>
+        <w:t xml:space="preserve">Longevity Life Academy Targets the Underserved Middle of the $8 Trillion Longevity Market</w:t>
       </w:r>
     </w:p>
     <w:p>
@@ -1352,7 +1352,7 @@
           <w:sz w:val="26"/>
           <w:szCs w:val="26"/>
         </w:rPr>
-        <w:t xml:space="preserve">Longevity Life Academy Offers an 18-Week Live Longevity Class From $289 a Month, Glucose Monitor Included</w:t>
+        <w:t xml:space="preserve">Longevity Life Academy Offers an 18-Week Live Longevity Class With a Glucose Monitor Included</w:t>
       </w:r>
     </w:p>
     <w:p>
@@ -4844,7 +4844,7 @@
           <w:sz w:val="26"/>
           <w:szCs w:val="26"/>
         </w:rPr>
-        <w:t xml:space="preserve">Her $12-a-Day Routine Ranked Ahead of Bryan Johnson — Longevity Life Academy Teaches the Habits Behind It, From $289 a Month</w:t>
+        <w:t xml:space="preserve">Her $12-a-Day Routine Ranked Ahead of Bryan Johnson — Longevity Life Academy Teaches the Habits Behind It</w:t>
       </w:r>
     </w:p>
     <w:p>
@@ -5070,7 +5070,7 @@
           <w:sz w:val="26"/>
           <w:szCs w:val="26"/>
         </w:rPr>
-        <w:t xml:space="preserve">You Don't Need Bryan Johnson's Budget to Live Longer — Longevity Life Academy Puts Science-Backed Healthy Aging Within Reach for $289 a Month</w:t>
+        <w:t xml:space="preserve">You Don't Need Bryan Johnson's Budget to Live Longer — Longevity Life Academy Puts Science-Backed Healthy Aging Within Reach</w:t>
       </w:r>
     </w:p>
     <w:p>

</xml_diff>

<commit_message>
Julie = founding faculty teaching masterclasses (not the Blueprint); simplify openings
</commit_message>
<xml_diff>
--- a/eTeacher_LLA_Press_Releases.docx
+++ b/eTeacher_LLA_Press_Releases.docx
@@ -1614,7 +1614,7 @@
           <w:sz w:val="26"/>
           <w:szCs w:val="26"/>
         </w:rPr>
-        <w:t xml:space="preserve">Julie Gibson Clark — Who Out-Aged Bryan Johnson at the Rejuvenation Olympics — Joins eTeacher's Longevity Life Academy Faculty</w:t>
+        <w:t xml:space="preserve">Julie Gibson Clark — Who Out-Aged Bryan Johnson at the Rejuvenation Olympics — Joins Longevity Life Academy as Founding Faculty</w:t>
       </w:r>
     </w:p>
     <w:p>
@@ -1630,22 +1630,22 @@
           <w:sz w:val="21"/>
           <w:szCs w:val="21"/>
         </w:rPr>
-        <w:t xml:space="preserve">The Phoenix single mom who held second place on the Rejuvenation Olympics for over a year — ahead of Bryan Johnson — will teach live cohorts inside the 18-week Longevity Blueprint.</w:t>
-      </w:r>
-    </w:p>
-    <w:p>
-      <w:pPr>
-        <w:spacing w:after="100"/>
-        <w:jc w:val="left"/>
-      </w:pPr>
-      <w:r>
-        <w:rPr>
-          <w:rFonts w:ascii="Calibri" w:cs="Calibri" w:eastAsia="Calibri" w:hAnsi="Calibri"/>
-          <w:color w:val="1A1F26"/>
-          <w:sz w:val="20"/>
-          <w:szCs w:val="20"/>
-        </w:rPr>
-        <w:t xml:space="preserve">PHOENIX — eTeacher Group today announced that Julie Gibson Clark — who held the #2 spot on the Rejuvenation Olympics leaderboard for more than a year, ahead of the contest's own founder, Bryan Johnson — has joined the live faculty of Longevity Life Academy.</w:t>
+        <w:t xml:space="preserve">The Phoenix single mom who held second place on the Rejuvenation Olympics for over a year — ahead of Bryan Johnson — joins Longevity Life Academy as founding faculty to teach its live masterclasses.</w:t>
+      </w:r>
+    </w:p>
+    <w:p>
+      <w:pPr>
+        <w:spacing w:after="100"/>
+        <w:jc w:val="left"/>
+      </w:pPr>
+      <w:r>
+        <w:rPr>
+          <w:rFonts w:ascii="Calibri" w:cs="Calibri" w:eastAsia="Calibri" w:hAnsi="Calibri"/>
+          <w:color w:val="1A1F26"/>
+          <w:sz w:val="20"/>
+          <w:szCs w:val="20"/>
+        </w:rPr>
+        <w:t xml:space="preserve">PHOENIX — Longevity Life Academy has named Julie Gibson Clark to its founding faculty. She held the #2 spot on the Rejuvenation Olympics leaderboard for more than a year — ahead of the contest's own founder, Bryan Johnson.</w:t>
       </w:r>
     </w:p>
     <w:p>
@@ -1675,7 +1675,7 @@
           <w:sz w:val="20"/>
           <w:szCs w:val="20"/>
         </w:rPr>
-        <w:t xml:space="preserve">At LLA she will teach live cohorts of 8–15 students inside The Longevity Blueprint, an 18-week program that guides students to build personalized protocols from their own Abbott Lingo glucose monitor and wearable data across six pillars.</w:t>
+        <w:t xml:space="preserve">At LLA she will lead live masterclasses, teaching students the everyday habits behind her results — across nutrition, movement, sleep, and stress — alongside the school's core faculty.</w:t>
       </w:r>
     </w:p>
     <w:p>
@@ -1720,7 +1720,7 @@
           <w:sz w:val="20"/>
           <w:szCs w:val="20"/>
         </w:rPr>
-        <w:t xml:space="preserve">“We measure ourselves by results, and Julie's results are impossible to argue with,” said eTeacher CEO Harel Tayeb. “She proved what we teach every day — that world-class health is built from consistent, learnable habits, not from a millionaire's budget. Having her teach it live is exactly the school we set out to build.” Gibson Clark begins teaching with the current enrollment cohort.</w:t>
+        <w:t xml:space="preserve">“We measure ourselves by results, and Julie's results are impossible to argue with,” said eTeacher CEO Harel Tayeb. “She proved what we teach every day — that world-class health is built from consistent, learnable habits, not from a millionaire's budget. Having her teach it live is exactly the school we set out to build.” Gibson Clark's masterclasses begin with the current enrollment cohort.</w:t>
       </w:r>
     </w:p>
     <w:p>
@@ -1886,7 +1886,7 @@
           <w:sz w:val="26"/>
           <w:szCs w:val="26"/>
         </w:rPr>
-        <w:t xml:space="preserve">Longevity Life Academy Hires Julie Gibson Clark, Who Out-Aged a $2M-a-Year Biohacker on $12 a Day</w:t>
+        <w:t xml:space="preserve">Longevity Life Academy Names Julie Gibson Clark Founding Faculty — She Out-Aged a $2M-a-Year Biohacker on $12 a Day</w:t>
       </w:r>
     </w:p>
     <w:p>
@@ -1902,22 +1902,22 @@
           <w:sz w:val="21"/>
           <w:szCs w:val="21"/>
         </w:rPr>
-        <w:t xml:space="preserve">Julie Gibson Clark's budget longevity results ranked her #2 in the world; now she's teaching the method inside a course that starts at $289 a month.</w:t>
-      </w:r>
-    </w:p>
-    <w:p>
-      <w:pPr>
-        <w:spacing w:after="100"/>
-        <w:jc w:val="left"/>
-      </w:pPr>
-      <w:r>
-        <w:rPr>
-          <w:rFonts w:ascii="Calibri" w:cs="Calibri" w:eastAsia="Calibri" w:hAnsi="Calibri"/>
-          <w:color w:val="1A1F26"/>
-          <w:sz w:val="20"/>
-          <w:szCs w:val="20"/>
-        </w:rPr>
-        <w:t xml:space="preserve">PHOENIX — Julie Gibson Clark became a global story for a simple, provocative reason: she achieved elite anti-aging results without an elite budget, ranking second worldwide on roughly $100–150 a month — about $12 a day — while Bryan Johnson reportedly spends around $2 million a year.</w:t>
+        <w:t xml:space="preserve">Julie Gibson Clark's budget longevity results ranked her #2 in the world; now she teaches the method in Longevity Life Academy's live masterclasses.</w:t>
+      </w:r>
+    </w:p>
+    <w:p>
+      <w:pPr>
+        <w:spacing w:after="100"/>
+        <w:jc w:val="left"/>
+      </w:pPr>
+      <w:r>
+        <w:rPr>
+          <w:rFonts w:ascii="Calibri" w:cs="Calibri" w:eastAsia="Calibri" w:hAnsi="Calibri"/>
+          <w:color w:val="1A1F26"/>
+          <w:sz w:val="20"/>
+          <w:szCs w:val="20"/>
+        </w:rPr>
+        <w:t xml:space="preserve">PHOENIX — Julie Gibson Clark became a global story for a simple reason: she achieved elite anti-aging results without an elite budget, ranking second worldwide on roughly $12 a day, while Bryan Johnson reportedly spends around $2 million a year.</w:t>
       </w:r>
     </w:p>
     <w:p>
@@ -1947,7 +1947,7 @@
           <w:sz w:val="20"/>
           <w:szCs w:val="20"/>
         </w:rPr>
-        <w:t xml:space="preserve">Now that philosophy has an institution behind it. As a Longevity Life Academy instructor, Gibson Clark brings her low-cost, high-consistency method into eTeacher's live cohorts of 8–15, where The Longevity Blueprint starts at $289 per month and includes an Abbott Lingo glucose monitor shipped to every US student.</w:t>
+        <w:t xml:space="preserve">Now that philosophy has an institution behind it. As founding faculty at Longevity Life Academy, Gibson Clark brings her low-cost, high-consistency method into live masterclasses, teaching students the fundamentals directly rather than leaving them to piece it together alone.</w:t>
       </w:r>
     </w:p>
     <w:p>
@@ -2219,7 +2219,7 @@
           <w:sz w:val="20"/>
           <w:szCs w:val="20"/>
         </w:rPr>
-        <w:t xml:space="preserve">At Longevity Life Academy, that same philosophy anchors her live teaching: start with your why, then build one sustainable habit at a time until it sticks. She'll lead small cohorts of 8–15 through the 18-week Longevity Blueprint, each student working from their own glucose and wearable data.</w:t>
+        <w:t xml:space="preserve">At Longevity Life Academy, that same philosophy anchors her live masterclasses: start with your why, then build one sustainable habit at a time until it sticks — teaching students the practices behind her own results.</w:t>
       </w:r>
     </w:p>
     <w:p>
@@ -2430,7 +2430,7 @@
           <w:sz w:val="26"/>
           <w:szCs w:val="26"/>
         </w:rPr>
-        <w:t xml:space="preserve">Longevity Life Academy Instructor Julie Gibson Clark to Teach the Habits Behind Her 34%-Slower Aging</w:t>
+        <w:t xml:space="preserve">Longevity Life Academy Founding Faculty Member Julie Gibson Clark to Teach the Habits Behind Her 34%-Slower Aging</w:t>
       </w:r>
     </w:p>
     <w:p>
@@ -2446,22 +2446,22 @@
           <w:sz w:val="21"/>
           <w:szCs w:val="21"/>
         </w:rPr>
-        <w:t xml:space="preserve">Her biomarker data suggests she ages about 34% slower than average; at Longevity Life Academy she'll teach the strength, protein, and VO2-max fundamentals behind it.</w:t>
-      </w:r>
-    </w:p>
-    <w:p>
-      <w:pPr>
-        <w:spacing w:after="100"/>
-        <w:jc w:val="left"/>
-      </w:pPr>
-      <w:r>
-        <w:rPr>
-          <w:rFonts w:ascii="Calibri" w:cs="Calibri" w:eastAsia="Calibri" w:hAnsi="Calibri"/>
-          <w:color w:val="1A1F26"/>
-          <w:sz w:val="20"/>
-          <w:szCs w:val="20"/>
-        </w:rPr>
-        <w:t xml:space="preserve">PHOENIX — The number that made Julie Gibson Clark famous is a DunedinPACE score of 0.665 — a measure of the pace of biological aging suggesting she ages roughly 65 days for every 100, or about 34% slower than average. She now brings the science behind that number to Longevity Life Academy.</w:t>
+        <w:t xml:space="preserve">Her biomarker data suggests she ages about 34% slower than average; in her Longevity Life Academy masterclasses she'll teach the strength, protein, and VO2-max fundamentals behind it.</w:t>
+      </w:r>
+    </w:p>
+    <w:p>
+      <w:pPr>
+        <w:spacing w:after="100"/>
+        <w:jc w:val="left"/>
+      </w:pPr>
+      <w:r>
+        <w:rPr>
+          <w:rFonts w:ascii="Calibri" w:cs="Calibri" w:eastAsia="Calibri" w:hAnsi="Calibri"/>
+          <w:color w:val="1A1F26"/>
+          <w:sz w:val="20"/>
+          <w:szCs w:val="20"/>
+        </w:rPr>
+        <w:t xml:space="preserve">PHOENIX — The number that made Julie Gibson Clark famous is a DunedinPACE score of 0.665 — a measure of the pace of biological aging suggesting she ages roughly 65 days for every 100, or about 34% slower than average. She now brings the science behind that number to Longevity Life Academy as founding faculty.</w:t>
       </w:r>
     </w:p>
     <w:p>
@@ -2491,22 +2491,22 @@
           <w:sz w:val="20"/>
           <w:szCs w:val="20"/>
         </w:rPr>
-        <w:t xml:space="preserve">That evidence-based, data-driven approach maps directly onto LLA's method, which puts an Abbott Lingo continuous glucose monitor in every student's hands before Lesson 5 and teaches them to read glucose, HRV, and sleep as a live feedback loop across the six pillars.</w:t>
-      </w:r>
-    </w:p>
-    <w:p>
-      <w:pPr>
-        <w:spacing w:after="100"/>
-        <w:jc w:val="left"/>
-      </w:pPr>
-      <w:r>
-        <w:rPr>
-          <w:rFonts w:ascii="Calibri" w:cs="Calibri" w:eastAsia="Calibri" w:hAnsi="Calibri"/>
-          <w:color w:val="1A1F26"/>
-          <w:sz w:val="20"/>
-          <w:szCs w:val="20"/>
-        </w:rPr>
-        <w:t xml:space="preserve">Her focus areas align with the curriculum's Exercise &amp; Movement, Nutrition, Sleep, and Stress Management pillars — alongside named instructors such as UC Santa Barbara senior lecturer and NASM-certified trainer Amy Jamieson — grounding the program in verifiable outcomes rather than trends.</w:t>
+        <w:t xml:space="preserve">That evidence-based, data-driven approach maps directly onto LLA's method, which teaches students to read glucose, HRV, and sleep as a live feedback loop across the six pillars.</w:t>
+      </w:r>
+    </w:p>
+    <w:p>
+      <w:pPr>
+        <w:spacing w:after="100"/>
+        <w:jc w:val="left"/>
+      </w:pPr>
+      <w:r>
+        <w:rPr>
+          <w:rFonts w:ascii="Calibri" w:cs="Calibri" w:eastAsia="Calibri" w:hAnsi="Calibri"/>
+          <w:color w:val="1A1F26"/>
+          <w:sz w:val="20"/>
+          <w:szCs w:val="20"/>
+        </w:rPr>
+        <w:t xml:space="preserve">Her masterclass focus areas align with the Exercise &amp; Movement, Nutrition, Sleep, and Stress Management pillars — alongside named instructors such as UC Santa Barbara senior lecturer and NASM-certified trainer Amy Jamieson — grounding the teaching in verifiable outcomes rather than trends.</w:t>
       </w:r>
     </w:p>
     <w:p>
@@ -2717,7 +2717,7 @@
           <w:sz w:val="20"/>
           <w:szCs w:val="20"/>
         </w:rPr>
-        <w:t xml:space="preserve">LLA operationalizes that counterexample. By combining a relatable, low-cost instructor with a proven live-education model — small cohorts of 8–15, an included Abbott Lingo glucose monitor, tuition from $289 a month — it aims to make personalized longevity available to mainstream American families.</w:t>
+        <w:t xml:space="preserve">LLA operationalizes that counterexample. By adding a relatable, low-cost founding-faculty voice to a proven live-education model — small cohorts of 8–15, an included Abbott Lingo glucose monitor, and named instructors — it aims to make personalized longevity available to mainstream American families.</w:t>
       </w:r>
     </w:p>
     <w:p>
@@ -2928,7 +2928,7 @@
           <w:sz w:val="26"/>
           <w:szCs w:val="26"/>
         </w:rPr>
-        <w:t xml:space="preserve">Julie Gibson Clark Joins Longevity Life Academy to Teach Its 18-Week Live Longevity Blueprint</w:t>
+        <w:t xml:space="preserve">Julie Gibson Clark Joins Longevity Life Academy as Founding Faculty to Lead Its Live Masterclasses</w:t>
       </w:r>
     </w:p>
     <w:p>
@@ -2944,52 +2944,52 @@
           <w:sz w:val="21"/>
           <w:szCs w:val="21"/>
         </w:rPr>
-        <w:t xml:space="preserve">The recruiter who held the Rejuvenation Olympics #2 spot for over a year joins Longevity Life Academy to teach strength, protein, and sleep as the trainable foundations of a longer life.</w:t>
-      </w:r>
-    </w:p>
-    <w:p>
-      <w:pPr>
-        <w:spacing w:after="100"/>
-        <w:jc w:val="left"/>
-      </w:pPr>
-      <w:r>
-        <w:rPr>
-          <w:rFonts w:ascii="Calibri" w:cs="Calibri" w:eastAsia="Calibri" w:hAnsi="Calibri"/>
-          <w:color w:val="1A1F26"/>
-          <w:sz w:val="20"/>
-          <w:szCs w:val="20"/>
-        </w:rPr>
-        <w:t xml:space="preserve">PHOENIX — As Julie Gibson Clark joins Longevity Life Academy's live faculty, the practical question is what, exactly, she'll teach — and the answer mirrors the routine that made her a global story: build one sustainable habit at a time until it becomes automatic.</w:t>
-      </w:r>
-    </w:p>
-    <w:p>
-      <w:pPr>
-        <w:spacing w:after="100"/>
-        <w:jc w:val="left"/>
-      </w:pPr>
-      <w:r>
-        <w:rPr>
-          <w:rFonts w:ascii="Calibri" w:cs="Calibri" w:eastAsia="Calibri" w:hAnsi="Calibri"/>
-          <w:color w:val="1A1F26"/>
-          <w:sz w:val="20"/>
-          <w:szCs w:val="20"/>
-        </w:rPr>
-        <w:t xml:space="preserve">Her curriculum contribution slots directly into LLA's six pillars. Gibson Clark's expertise — strength training, 100–130g of protein daily, VO2-max and Zone 2 conditioning, sauna and cold, and disciplined 7–8-hour sleep — maps onto the Exercise &amp; Movement, Nutrition, Sleep, and Stress Management pillars of the 18-week program.</w:t>
-      </w:r>
-    </w:p>
-    <w:p>
-      <w:pPr>
-        <w:spacing w:after="100"/>
-        <w:jc w:val="left"/>
-      </w:pPr>
-      <w:r>
-        <w:rPr>
-          <w:rFonts w:ascii="Calibri" w:cs="Calibri" w:eastAsia="Calibri" w:hAnsi="Calibri"/>
-          <w:color w:val="1A1F26"/>
-          <w:sz w:val="20"/>
-          <w:szCs w:val="20"/>
-        </w:rPr>
-        <w:t xml:space="preserve">Within the four-phase Longevity Blueprint, she'll guide small cohorts of 8–15 as they move from Foundation through Data &amp; Discovery — the phase where each student's Abbott Lingo glucose monitor arrives before Lesson 5 — to a written protocol tested against their own biology.</w:t>
+        <w:t xml:space="preserve">The recruiter who held the Rejuvenation Olympics #2 spot for over a year joins Longevity Life Academy as founding faculty, teaching live masterclasses on strength, protein, and sleep as the trainable foundations of a longer life.</w:t>
+      </w:r>
+    </w:p>
+    <w:p>
+      <w:pPr>
+        <w:spacing w:after="100"/>
+        <w:jc w:val="left"/>
+      </w:pPr>
+      <w:r>
+        <w:rPr>
+          <w:rFonts w:ascii="Calibri" w:cs="Calibri" w:eastAsia="Calibri" w:hAnsi="Calibri"/>
+          <w:color w:val="1A1F26"/>
+          <w:sz w:val="20"/>
+          <w:szCs w:val="20"/>
+        </w:rPr>
+        <w:t xml:space="preserve">PHOENIX — Julie Gibson Clark has joined Longevity Life Academy as founding faculty. The practical question is what she'll teach — and the answer mirrors the routine that made her a global story: build one sustainable habit at a time until it becomes automatic.</w:t>
+      </w:r>
+    </w:p>
+    <w:p>
+      <w:pPr>
+        <w:spacing w:after="100"/>
+        <w:jc w:val="left"/>
+      </w:pPr>
+      <w:r>
+        <w:rPr>
+          <w:rFonts w:ascii="Calibri" w:cs="Calibri" w:eastAsia="Calibri" w:hAnsi="Calibri"/>
+          <w:color w:val="1A1F26"/>
+          <w:sz w:val="20"/>
+          <w:szCs w:val="20"/>
+        </w:rPr>
+        <w:t xml:space="preserve">Her masterclasses draw on LLA's six pillars. Gibson Clark's expertise — strength training, 100–130g of protein daily, VO2-max and Zone 2 conditioning, sauna and cold, and disciplined 7–8-hour sleep — spans the Exercise &amp; Movement, Nutrition, Sleep, and Stress Management pillars.</w:t>
+      </w:r>
+    </w:p>
+    <w:p>
+      <w:pPr>
+        <w:spacing w:after="100"/>
+        <w:jc w:val="left"/>
+      </w:pPr>
+      <w:r>
+        <w:rPr>
+          <w:rFonts w:ascii="Calibri" w:cs="Calibri" w:eastAsia="Calibri" w:hAnsi="Calibri"/>
+          <w:color w:val="1A1F26"/>
+          <w:sz w:val="20"/>
+          <w:szCs w:val="20"/>
+        </w:rPr>
+        <w:t xml:space="preserve">In her live masterclasses she'll guide students through the same fundamentals she lives by, showing how everyday habits — not exotic interventions — produced her results.</w:t>
       </w:r>
     </w:p>
     <w:p>
@@ -3154,7 +3154,7 @@
           <w:sz w:val="26"/>
           <w:szCs w:val="26"/>
         </w:rPr>
-        <w:t xml:space="preserve">Longevity Life Academy Instructor Julie Gibson Clark Demonstrates Her $12-a-Day Longevity Routine Live</w:t>
+        <w:t xml:space="preserve">Longevity Life Academy Founding Faculty Member Julie Gibson Clark Demonstrates Her $12-a-Day Longevity Routine Live</w:t>
       </w:r>
     </w:p>
     <w:p>
@@ -3185,7 +3185,7 @@
           <w:sz w:val="20"/>
           <w:szCs w:val="20"/>
         </w:rPr>
-        <w:t xml:space="preserve">PHOENIX — Julie Gibson Clark's story is tailor-made for broadcast: a 56-year-old Phoenix single mom and former structural engineer who ranked #2 on a global longevity leaderboard — ahead of Bryan Johnson — on roughly $100–150 a month, and who has now taken a live teaching role at eTeacher's Longevity Life Academy.</w:t>
+        <w:t xml:space="preserve">PHOENIX — Julie Gibson Clark's story is tailor-made for broadcast: a 56-year-old Phoenix single mom and former structural engineer who ranked #2 on a global longevity leaderboard — ahead of Bryan Johnson — on roughly $100–150 a month, and who has now joined eTeacher's Longevity Life Academy as founding faculty, leading its live masterclasses.</w:t>
       </w:r>
     </w:p>
     <w:p>
@@ -4860,7 +4860,7 @@
           <w:sz w:val="21"/>
           <w:szCs w:val="21"/>
         </w:rPr>
-        <w:t xml:space="preserve">Longevity Life Academy student-turned-instructor Julie Gibson Clark once ranked second in the Rejuvenation Olympics — ahead of Bryan Johnson — on a fraction of the budget. As Johnson faces a hard diagnosis, her story shows what consistency can do.</w:t>
+        <w:t xml:space="preserve">Longevity Life Academy founding faculty member Julie Gibson Clark once ranked second in the Rejuvenation Olympics — ahead of Bryan Johnson — on a fraction of the budget. As Johnson faces a hard diagnosis, her story shows what consistency can do.</w:t>
       </w:r>
     </w:p>
     <w:p>
@@ -4905,7 +4905,7 @@
           <w:sz w:val="20"/>
           <w:szCs w:val="20"/>
         </w:rPr>
-        <w:t xml:space="preserve">That is precisely what Longevity Life Academy teaches, and why the company brought Julie in as an instructor. The academy's 18-week live course, taught in groups of 8–15 with an Abbott Lingo glucose monitor shipped to every US student, turns the fundamentals she lives by into a protocol any motivated adult can learn and keep.</w:t>
+        <w:t xml:space="preserve">That is precisely what Longevity Life Academy teaches, and why the company brought Julie on as founding faculty for its live masterclasses. The academy's 18-week course, taught in groups of 8–15 with an Abbott Lingo glucose monitor shipped to every US student, turns the fundamentals she lives by into a protocol any motivated adult can learn and keep.</w:t>
       </w:r>
     </w:p>
     <w:p>

</xml_diff>